<commit_message>
Caso de Uso 5
</commit_message>
<xml_diff>
--- a/Desarrollo/Sistema de Control de Peso (SISCOP)/Analisis/Casos de Uso/SISCOP-CU05.docx
+++ b/Desarrollo/Sistema de Control de Peso (SISCOP)/Analisis/Casos de Uso/SISCOP-CU05.docx
@@ -1338,7 +1338,7 @@
     </w:p>
     <w:sdt>
       <w:sdtPr>
-        <w:id w:val="-950608553"/>
+        <w:id w:val="-241579811"/>
         <w:docPartObj>
           <w:docPartGallery w:val="Table of Contents"/>
           <w:docPartUnique w:val="1"/>
@@ -3975,7 +3975,7 @@
           <w:szCs w:val="24"/>
           <w:rtl w:val="0"/>
         </w:rPr>
-        <w:t xml:space="preserve">Rendimiento: </w:t>
+        <w:t xml:space="preserve">Eficiencia: </w:t>
       </w:r>
       <w:r>
         <w:rPr>

</xml_diff>